<commit_message>
fix: clarify inheritance legal wording
</commit_message>
<xml_diff>
--- a/downloads/free-ending-note.docx
+++ b/downloads/free-ending-note.docx
@@ -31,7 +31,7 @@
           <w:sz w:val="18"/>
           <w:szCs w:val="18"/>
         </w:rPr>
-        <w:t xml:space="preserve">はじめての終活ガイド（shukatsu-guide.jp）｜執筆・監修：終活カウンセラー1級｜2026年8月版（v1.0）</w:t>
+        <w:t>はじめての終活ガイド（shukatsu-guide.jp）｜執筆・監修：終活カウンセラー1級｜2026年8月版（v1.1）</w:t>
       </w:r>
     </w:p>
     <w:tbl>
@@ -73,7 +73,7 @@
                 <w:sz w:val="18"/>
                 <w:szCs w:val="18"/>
               </w:rPr>
-              <w:t xml:space="preserve">ご注意：このノートに暗証番号・各種パスワード・マイナンバーなどの秘密情報そのものは書かないでください。書くのは「何が」「どこにあるか」までにとどめ、実際の番号は書かないことをおすすめします。書き終えたら、保管場所を信頼できるご家族に伝えてください。財産の分け方についての希望は、このノートに書いても法的効力はありません。法的な効力を持たせたい場合は、遺言書の作成をご検討ください（詳しくは「遺言書の種類と費用」の記事）。</w:t>
+              <w:t>ご注意：暗証番号・各種パスワード・マイナンバーなどの秘密情報そのものは書かず、「何が」「どこにあるか」までにとどめ、保管場所を信頼できるご家族に伝えてください。財産の分け方をこのノートに書いても、通常、財産を移す法的効力は生じません。遺言による指定には方式を満たす遺言書が必要です。死因贈与や信託など別の方法もあるため、専門家にご確認ください（「遺言書の種類と費用」の記事も参照）。</w:t>
             </w:r>
           </w:p>
         </w:tc>
@@ -1577,7 +1577,7 @@
           <w:sz w:val="16"/>
           <w:szCs w:val="16"/>
         </w:rPr>
-        <w:t xml:space="preserve">書き方の詳しい解説 → https://shukatsu-guide.jp/articles/article02.html　｜　2026-08-03 v1.0</w:t>
+        <w:t>書き方の詳しい解説 → https://shukatsu-guide.jp/articles/article02.html　｜　2026-08-10 v1.1</w:t>
       </w:r>
     </w:p>
     <w:sectPr>

</xml_diff>